<commit_message>
Update topic_01 and documents
</commit_message>
<xml_diff>
--- a/TP-KB-251-Serhhii-Bezzub-lpr.docx
+++ b/TP-KB-251-Serhhii-Bezzub-lpr.docx
@@ -312,6 +312,124 @@
         </w:rPr>
         <w:t>:</w:t>
       </w:r>
+      <w:r>
+        <w:rPr>
+          <w:lang w:val="ru-RU"/>
+        </w:rPr>
+        <w:t xml:space="preserve"> </w:t>
+      </w:r>
+      <w:hyperlink r:id="rId4" w:history="1">
+        <w:r>
+          <w:rPr>
+            <w:rStyle w:val="a4"/>
+          </w:rPr>
+          <w:t>https</w:t>
+        </w:r>
+        <w:r>
+          <w:rPr>
+            <w:rStyle w:val="a4"/>
+            <w:lang w:val="ru-RU"/>
+          </w:rPr>
+          <w:t>://</w:t>
+        </w:r>
+        <w:r>
+          <w:rPr>
+            <w:rStyle w:val="a4"/>
+          </w:rPr>
+          <w:t>github</w:t>
+        </w:r>
+        <w:r>
+          <w:rPr>
+            <w:rStyle w:val="a4"/>
+            <w:lang w:val="ru-RU"/>
+          </w:rPr>
+          <w:t>.</w:t>
+        </w:r>
+        <w:r>
+          <w:rPr>
+            <w:rStyle w:val="a4"/>
+          </w:rPr>
+          <w:t>com</w:t>
+        </w:r>
+        <w:r>
+          <w:rPr>
+            <w:rStyle w:val="a4"/>
+            <w:lang w:val="ru-RU"/>
+          </w:rPr>
+          <w:t>/</w:t>
+        </w:r>
+        <w:r>
+          <w:rPr>
+            <w:rStyle w:val="a4"/>
+          </w:rPr>
+          <w:t>Teraliter</w:t>
+        </w:r>
+        <w:r>
+          <w:rPr>
+            <w:rStyle w:val="a4"/>
+            <w:lang w:val="ru-RU"/>
+          </w:rPr>
+          <w:t>/--251-/</w:t>
+        </w:r>
+        <w:r>
+          <w:rPr>
+            <w:rStyle w:val="a4"/>
+          </w:rPr>
+          <w:t>blob</w:t>
+        </w:r>
+        <w:r>
+          <w:rPr>
+            <w:rStyle w:val="a4"/>
+            <w:lang w:val="ru-RU"/>
+          </w:rPr>
+          <w:t>/</w:t>
+        </w:r>
+        <w:r>
+          <w:rPr>
+            <w:rStyle w:val="a4"/>
+          </w:rPr>
+          <w:t>main</w:t>
+        </w:r>
+        <w:r>
+          <w:rPr>
+            <w:rStyle w:val="a4"/>
+            <w:lang w:val="ru-RU"/>
+          </w:rPr>
+          <w:t>/</w:t>
+        </w:r>
+        <w:r>
+          <w:rPr>
+            <w:rStyle w:val="a4"/>
+          </w:rPr>
+          <w:t>topic</w:t>
+        </w:r>
+        <w:r>
+          <w:rPr>
+            <w:rStyle w:val="a4"/>
+            <w:lang w:val="ru-RU"/>
+          </w:rPr>
+          <w:t>_01/</w:t>
+        </w:r>
+        <w:r>
+          <w:rPr>
+            <w:rStyle w:val="a4"/>
+          </w:rPr>
+          <w:t>task</w:t>
+        </w:r>
+        <w:r>
+          <w:rPr>
+            <w:rStyle w:val="a4"/>
+            <w:lang w:val="ru-RU"/>
+          </w:rPr>
+          <w:t>1.</w:t>
+        </w:r>
+        <w:r>
+          <w:rPr>
+            <w:rStyle w:val="a4"/>
+          </w:rPr>
+          <w:t>py</w:t>
+        </w:r>
+      </w:hyperlink>
     </w:p>
     <w:p>
       <w:pPr>
@@ -333,6 +451,54 @@
           <w:lang w:val="ru-RU"/>
         </w:rPr>
         <w:t>:</w:t>
+      </w:r>
+    </w:p>
+    <w:p>
+      <w:pPr>
+        <w:rPr>
+          <w:lang w:val="ru-RU"/>
+        </w:rPr>
+      </w:pPr>
+      <w:r>
+        <w:rPr>
+          <w:noProof/>
+        </w:rPr>
+        <w:lastRenderedPageBreak/>
+        <w:drawing>
+          <wp:inline distT="0" distB="0" distL="0" distR="0" wp14:anchorId="23545090" wp14:editId="36207BE0">
+            <wp:extent cx="5943600" cy="2950845"/>
+            <wp:effectExtent l="0" t="0" r="0" b="1905"/>
+            <wp:docPr id="1" name="Рисунок 1"/>
+            <wp:cNvGraphicFramePr>
+              <a:graphicFrameLocks xmlns:a="http://schemas.openxmlformats.org/drawingml/2006/main" noChangeAspect="1"/>
+            </wp:cNvGraphicFramePr>
+            <a:graphic xmlns:a="http://schemas.openxmlformats.org/drawingml/2006/main">
+              <a:graphicData uri="http://schemas.openxmlformats.org/drawingml/2006/picture">
+                <pic:pic xmlns:pic="http://schemas.openxmlformats.org/drawingml/2006/picture">
+                  <pic:nvPicPr>
+                    <pic:cNvPr id="1" name=""/>
+                    <pic:cNvPicPr/>
+                  </pic:nvPicPr>
+                  <pic:blipFill>
+                    <a:blip r:embed="rId5"/>
+                    <a:stretch>
+                      <a:fillRect/>
+                    </a:stretch>
+                  </pic:blipFill>
+                  <pic:spPr>
+                    <a:xfrm>
+                      <a:off x="0" y="0"/>
+                      <a:ext cx="5943600" cy="2950845"/>
+                    </a:xfrm>
+                    <a:prstGeom prst="rect">
+                      <a:avLst/>
+                    </a:prstGeom>
+                  </pic:spPr>
+                </pic:pic>
+              </a:graphicData>
+            </a:graphic>
+          </wp:inline>
+        </w:drawing>
       </w:r>
     </w:p>
     <w:p>
@@ -548,7 +714,7 @@
     <w:p>
       <w:pPr>
         <w:rPr>
-          <w:lang w:val="uk-UA"/>
+          <w:lang w:val="ru-RU"/>
         </w:rPr>
       </w:pPr>
       <w:r>
@@ -557,18 +723,104 @@
         </w:rPr>
         <w:t>Посилання на github:</w:t>
       </w:r>
-    </w:p>
-    <w:p>
-      <w:pPr>
-        <w:rPr>
-          <w:lang w:val="uk-UA"/>
-        </w:rPr>
-      </w:pPr>
-      <w:r>
-        <w:rPr>
-          <w:lang w:val="uk-UA"/>
-        </w:rPr>
-        <w:t>Знімок екрану з посилання на github:</w:t>
+      <w:r>
+        <w:rPr>
+          <w:lang w:val="ru-RU"/>
+        </w:rPr>
+        <w:t xml:space="preserve"> </w:t>
+      </w:r>
+      <w:hyperlink r:id="rId6" w:history="1">
+        <w:r>
+          <w:rPr>
+            <w:rStyle w:val="a4"/>
+            <w:lang w:val="ru-RU"/>
+          </w:rPr>
+          <w:t>https://githu</w:t>
+        </w:r>
+        <w:r>
+          <w:rPr>
+            <w:rStyle w:val="a4"/>
+            <w:lang w:val="ru-RU"/>
+          </w:rPr>
+          <w:t>b</w:t>
+        </w:r>
+        <w:r>
+          <w:rPr>
+            <w:rStyle w:val="a4"/>
+            <w:lang w:val="ru-RU"/>
+          </w:rPr>
+          <w:t>.com/Teraliter/--251-/blob/main/topic_01/task2.py</w:t>
+        </w:r>
+      </w:hyperlink>
+    </w:p>
+    <w:p>
+      <w:pPr>
+        <w:rPr>
+          <w:lang w:val="ru-RU"/>
+        </w:rPr>
+      </w:pPr>
+      <w:r>
+        <w:rPr>
+          <w:lang w:val="uk-UA"/>
+        </w:rPr>
+        <w:t xml:space="preserve">Знімок екрану з посилання на </w:t>
+      </w:r>
+      <w:r>
+        <w:t>github</w:t>
+      </w:r>
+      <w:r>
+        <w:rPr>
+          <w:lang w:val="ru-RU"/>
+        </w:rPr>
+        <w:t>:</w:t>
+      </w:r>
+    </w:p>
+    <w:p>
+      <w:pPr>
+        <w:rPr>
+          <w:lang w:val="ru-RU"/>
+        </w:rPr>
+      </w:pPr>
+      <w:r>
+        <w:rPr>
+          <w:noProof/>
+        </w:rPr>
+        <w:lastRenderedPageBreak/>
+        <w:drawing>
+          <wp:inline distT="0" distB="0" distL="0" distR="0" wp14:anchorId="70390E81" wp14:editId="556FFB6E">
+            <wp:extent cx="5943600" cy="2950845"/>
+            <wp:effectExtent l="0" t="0" r="0" b="1905"/>
+            <wp:docPr id="2" name="Рисунок 2"/>
+            <wp:cNvGraphicFramePr>
+              <a:graphicFrameLocks xmlns:a="http://schemas.openxmlformats.org/drawingml/2006/main" noChangeAspect="1"/>
+            </wp:cNvGraphicFramePr>
+            <a:graphic xmlns:a="http://schemas.openxmlformats.org/drawingml/2006/main">
+              <a:graphicData uri="http://schemas.openxmlformats.org/drawingml/2006/picture">
+                <pic:pic xmlns:pic="http://schemas.openxmlformats.org/drawingml/2006/picture">
+                  <pic:nvPicPr>
+                    <pic:cNvPr id="1" name=""/>
+                    <pic:cNvPicPr/>
+                  </pic:nvPicPr>
+                  <pic:blipFill>
+                    <a:blip r:embed="rId7"/>
+                    <a:stretch>
+                      <a:fillRect/>
+                    </a:stretch>
+                  </pic:blipFill>
+                  <pic:spPr>
+                    <a:xfrm>
+                      <a:off x="0" y="0"/>
+                      <a:ext cx="5943600" cy="2950845"/>
+                    </a:xfrm>
+                    <a:prstGeom prst="rect">
+                      <a:avLst/>
+                    </a:prstGeom>
+                  </pic:spPr>
+                </pic:pic>
+              </a:graphicData>
+            </a:graphic>
+          </wp:inline>
+        </w:drawing>
       </w:r>
     </w:p>
     <w:p>
@@ -738,7 +990,7 @@
     <w:p>
       <w:pPr>
         <w:rPr>
-          <w:lang w:val="uk-UA"/>
+          <w:lang w:val="ru-RU"/>
         </w:rPr>
       </w:pPr>
       <w:r>
@@ -747,11 +999,141 @@
         </w:rPr>
         <w:t>Посилання на github:</w:t>
       </w:r>
-    </w:p>
-    <w:p>
-      <w:pPr>
-        <w:rPr>
-          <w:lang w:val="uk-UA"/>
+      <w:r>
+        <w:rPr>
+          <w:lang w:val="ru-RU"/>
+        </w:rPr>
+        <w:t xml:space="preserve"> </w:t>
+      </w:r>
+      <w:hyperlink r:id="rId8" w:history="1">
+        <w:r>
+          <w:rPr>
+            <w:rStyle w:val="a4"/>
+          </w:rPr>
+          <w:t>https</w:t>
+        </w:r>
+        <w:r>
+          <w:rPr>
+            <w:rStyle w:val="a4"/>
+            <w:lang w:val="ru-RU"/>
+          </w:rPr>
+          <w:t>://</w:t>
+        </w:r>
+        <w:r>
+          <w:rPr>
+            <w:rStyle w:val="a4"/>
+          </w:rPr>
+          <w:t>gith</w:t>
+        </w:r>
+        <w:r>
+          <w:rPr>
+            <w:rStyle w:val="a4"/>
+          </w:rPr>
+          <w:t>u</w:t>
+        </w:r>
+        <w:r>
+          <w:rPr>
+            <w:rStyle w:val="a4"/>
+          </w:rPr>
+          <w:t>b</w:t>
+        </w:r>
+        <w:r>
+          <w:rPr>
+            <w:rStyle w:val="a4"/>
+            <w:lang w:val="ru-RU"/>
+          </w:rPr>
+          <w:t>.</w:t>
+        </w:r>
+        <w:r>
+          <w:rPr>
+            <w:rStyle w:val="a4"/>
+          </w:rPr>
+          <w:t>com</w:t>
+        </w:r>
+        <w:r>
+          <w:rPr>
+            <w:rStyle w:val="a4"/>
+            <w:lang w:val="ru-RU"/>
+          </w:rPr>
+          <w:t>/</w:t>
+        </w:r>
+        <w:r>
+          <w:rPr>
+            <w:rStyle w:val="a4"/>
+          </w:rPr>
+          <w:t>Teraliter</w:t>
+        </w:r>
+        <w:r>
+          <w:rPr>
+            <w:rStyle w:val="a4"/>
+            <w:lang w:val="ru-RU"/>
+          </w:rPr>
+          <w:t>/--251-/</w:t>
+        </w:r>
+        <w:r>
+          <w:rPr>
+            <w:rStyle w:val="a4"/>
+          </w:rPr>
+          <w:t>blob</w:t>
+        </w:r>
+        <w:r>
+          <w:rPr>
+            <w:rStyle w:val="a4"/>
+            <w:lang w:val="ru-RU"/>
+          </w:rPr>
+          <w:t>/</w:t>
+        </w:r>
+        <w:r>
+          <w:rPr>
+            <w:rStyle w:val="a4"/>
+          </w:rPr>
+          <w:t>main</w:t>
+        </w:r>
+        <w:r>
+          <w:rPr>
+            <w:rStyle w:val="a4"/>
+            <w:lang w:val="ru-RU"/>
+          </w:rPr>
+          <w:t>/</w:t>
+        </w:r>
+        <w:r>
+          <w:rPr>
+            <w:rStyle w:val="a4"/>
+          </w:rPr>
+          <w:t>topic</w:t>
+        </w:r>
+        <w:r>
+          <w:rPr>
+            <w:rStyle w:val="a4"/>
+            <w:lang w:val="ru-RU"/>
+          </w:rPr>
+          <w:t>_01/</w:t>
+        </w:r>
+        <w:r>
+          <w:rPr>
+            <w:rStyle w:val="a4"/>
+          </w:rPr>
+          <w:t>task</w:t>
+        </w:r>
+        <w:r>
+          <w:rPr>
+            <w:rStyle w:val="a4"/>
+            <w:lang w:val="ru-RU"/>
+          </w:rPr>
+          <w:t>3.</w:t>
+        </w:r>
+        <w:r>
+          <w:rPr>
+            <w:rStyle w:val="a4"/>
+          </w:rPr>
+          <w:t>py</w:t>
+        </w:r>
+      </w:hyperlink>
+    </w:p>
+    <w:p>
+      <w:pPr>
+        <w:rPr>
+          <w:lang w:val="ru-RU"/>
         </w:rPr>
       </w:pPr>
       <w:r>
@@ -759,6 +1141,54 @@
           <w:lang w:val="uk-UA"/>
         </w:rPr>
         <w:t>Знімок екрану з посилання на github:</w:t>
+      </w:r>
+      <w:r>
+        <w:rPr>
+          <w:lang w:val="ru-RU"/>
+        </w:rPr>
+        <w:t xml:space="preserve"> </w:t>
+      </w:r>
+    </w:p>
+    <w:p>
+      <w:r>
+        <w:rPr>
+          <w:noProof/>
+        </w:rPr>
+        <w:drawing>
+          <wp:inline distT="0" distB="0" distL="0" distR="0" wp14:anchorId="44DB3681" wp14:editId="59A206F3">
+            <wp:extent cx="5943600" cy="2950845"/>
+            <wp:effectExtent l="0" t="0" r="0" b="1905"/>
+            <wp:docPr id="4" name="Рисунок 4"/>
+            <wp:cNvGraphicFramePr>
+              <a:graphicFrameLocks xmlns:a="http://schemas.openxmlformats.org/drawingml/2006/main" noChangeAspect="1"/>
+            </wp:cNvGraphicFramePr>
+            <a:graphic xmlns:a="http://schemas.openxmlformats.org/drawingml/2006/main">
+              <a:graphicData uri="http://schemas.openxmlformats.org/drawingml/2006/picture">
+                <pic:pic xmlns:pic="http://schemas.openxmlformats.org/drawingml/2006/picture">
+                  <pic:nvPicPr>
+                    <pic:cNvPr id="1" name=""/>
+                    <pic:cNvPicPr/>
+                  </pic:nvPicPr>
+                  <pic:blipFill>
+                    <a:blip r:embed="rId9"/>
+                    <a:stretch>
+                      <a:fillRect/>
+                    </a:stretch>
+                  </pic:blipFill>
+                  <pic:spPr>
+                    <a:xfrm>
+                      <a:off x="0" y="0"/>
+                      <a:ext cx="5943600" cy="2950845"/>
+                    </a:xfrm>
+                    <a:prstGeom prst="rect">
+                      <a:avLst/>
+                    </a:prstGeom>
+                  </pic:spPr>
+                </pic:pic>
+              </a:graphicData>
+            </a:graphic>
+          </wp:inline>
+        </w:drawing>
       </w:r>
     </w:p>
     <w:sectPr>
@@ -1169,7 +1599,7 @@
   <w:style w:type="paragraph" w:default="1" w:styleId="a">
     <w:name w:val="Normal"/>
     <w:qFormat/>
-    <w:rsid w:val="00CC2AF9"/>
+    <w:rsid w:val="0052689D"/>
     <w:pPr>
       <w:spacing w:line="360" w:lineRule="auto"/>
       <w:ind w:firstLine="720"/>
@@ -1225,6 +1655,41 @@
         <w:insideV w:val="single" w:sz="4" w:space="0" w:color="auto"/>
       </w:tblBorders>
     </w:tblPr>
+  </w:style>
+  <w:style w:type="character" w:styleId="a4">
+    <w:name w:val="Hyperlink"/>
+    <w:basedOn w:val="a0"/>
+    <w:uiPriority w:val="99"/>
+    <w:unhideWhenUsed/>
+    <w:rsid w:val="00593F17"/>
+    <w:rPr>
+      <w:color w:val="0563C1" w:themeColor="hyperlink"/>
+      <w:u w:val="single"/>
+    </w:rPr>
+  </w:style>
+  <w:style w:type="character" w:styleId="a5">
+    <w:name w:val="Unresolved Mention"/>
+    <w:basedOn w:val="a0"/>
+    <w:uiPriority w:val="99"/>
+    <w:semiHidden/>
+    <w:unhideWhenUsed/>
+    <w:rsid w:val="00593F17"/>
+    <w:rPr>
+      <w:color w:val="605E5C"/>
+      <w:shd w:val="clear" w:color="auto" w:fill="E1DFDD"/>
+    </w:rPr>
+  </w:style>
+  <w:style w:type="character" w:styleId="a6">
+    <w:name w:val="FollowedHyperlink"/>
+    <w:basedOn w:val="a0"/>
+    <w:uiPriority w:val="99"/>
+    <w:semiHidden/>
+    <w:unhideWhenUsed/>
+    <w:rsid w:val="00593F17"/>
+    <w:rPr>
+      <w:color w:val="954F72" w:themeColor="followedHyperlink"/>
+      <w:u w:val="single"/>
+    </w:rPr>
   </w:style>
 </w:styles>
 </file>

</xml_diff>